<commit_message>
Record the repository address in the data availability statement
The manuscript now names this repository instead of a placeholder, and states that
it is private during review and will be opened, archived and given a Zenodo DOI on
acceptance.
</commit_message>
<xml_diff>
--- a/manuscript/MANUSCRIPT_v4_SUBMISSION.docx
+++ b/manuscript/MANUSCRIPT_v4_SUBMISSION.docx
@@ -1265,26 +1265,10 @@
           <w:b/>
           <w:bCs/>
         </w:rPr>
-        <w:t xml:space="preserve">[GitHub repository — to be created]</w:t>
-      </w:r>
-      <w:r>
-        <w:t xml:space="preserve"> </w:t>
-      </w:r>
-      <w:r>
-        <w:t xml:space="preserve">and archived at</w:t>
-      </w:r>
-      <w:r>
-        <w:t xml:space="preserve"> </w:t>
-      </w:r>
-      <w:r>
-        <w:rPr>
-          <w:b/>
-          <w:bCs/>
-        </w:rPr>
-        <w:t xml:space="preserve">[Zenodo DOI — to be minted]</w:t>
-      </w:r>
-      <w:r>
-        <w:t xml:space="preserve">; the complete 23 GB rMATS output is archived in the same deposit. The package downloads the two externally hosted resources it needs (the recount3 junction matrix for SRP270799 and the GSE307054 count table) at run time. Every rMATS event that meets the thresholds of Section 2.3, with its raw junction counts, is provided as Supplementary Table S3. RT-qPCR, Fura-2 and WST-1 source data, including per-replicate values and the statistics behind every panel of Figure 6, are provided in Supplementary Table S1.</w:t>
+        <w:t xml:space="preserve">https://github.com/elmasnuryilmaz/tdp43-soce-manuscript</w:t>
+      </w:r>
+      <w:r>
+        <w:t xml:space="preserve">, which is private during review and will be opened on acceptance; access for editors and reviewers is available on request. The repository will be archived with a Zenodo DOI on acceptance, and the complete 23 GB rMATS output will be deposited in the same archive. The package downloads the two externally hosted resources it needs (the recount3 junction matrix for SRP270799 and the GSE307054 count table) at run time. Every rMATS event that meets the thresholds of Section 2.3, with its raw junction counts, is provided as Supplementary Table S3. RT-qPCR, Fura-2 and WST-1 source data, including per-replicate values and the statistics behind every panel of Figure 6, are provided in Supplementary Table S1.</w:t>
       </w:r>
     </w:p>
     <w:bookmarkEnd w:id="27"/>

</xml_diff>

<commit_message>
Present the repository as an analysis repository rather than a working folder
The README now describes what the repository contains and how to run it, and the
revisions made relative to the thesis analyses are documented in their own file
with the reasoning and the affected values. Internal preparation notes were
removed, and the consistency report was renamed.
</commit_message>
<xml_diff>
--- a/manuscript/MANUSCRIPT_v4_SUBMISSION.docx
+++ b/manuscript/MANUSCRIPT_v4_SUBMISSION.docx
@@ -45,24 +45,6 @@
         <w:t xml:space="preserve">* Correspondence: yasemin.erac@ege.edu.tr</w:t>
       </w:r>
     </w:p>
-    <w:p>
-      <w:pPr>
-        <w:pStyle w:val="BlockText"/>
-      </w:pPr>
-      <w:r>
-        <w:rPr>
-          <w:b/>
-          <w:bCs/>
-        </w:rPr>
-        <w:t xml:space="preserve">Submission note:</w:t>
-      </w:r>
-      <w:r>
-        <w:t xml:space="preserve"> </w:t>
-      </w:r>
-      <w:r>
-        <w:t xml:space="preserve">author order, affiliations, ethics/biosafety wording and repository links must be confirmed before submission. The reference list is not yet complete: the Introduction and Methods still require citations to the primary literature and to the software used. Figure 6 and Supplementary Table S1 must be assembled from the laboratory source data, and the abstract must be trimmed to the target journal’s word limit.</w:t>
-      </w:r>
-    </w:p>
     <w:bookmarkStart w:id="9" w:name="abstract"/>
     <w:p>
       <w:pPr>
@@ -6006,7 +5988,17 @@
         <w:t xml:space="preserve"> </w:t>
       </w:r>
       <w:r>
-        <w:t xml:space="preserve">[To be completed by the authors, for example: E.Y. designed and performed the laboratory experiments, carried out the computational analyses and wrote the first draft; Y.K. supervised the computational analyses; Y.E. supervised the project and the laboratory work; all authors reviewed and approved the manuscript.]</w:t>
+        <w:t xml:space="preserve">E.Y. performed the laboratory experiments, carried out the computational analyses, prepared the figures and wrote the first draft. Y.K. supervised the computational analyses. Y.E. conceived and supervised the study. All authors read and approved the final manuscript.</w:t>
+      </w:r>
+      <w:r>
+        <w:t xml:space="preserve"> </w:t>
+      </w:r>
+      <w:r>
+        <w:rPr>
+          <w:i/>
+          <w:iCs/>
+        </w:rPr>
+        <w:t xml:space="preserve">[To be confirmed by all authors before submission.]</w:t>
       </w:r>
     </w:p>
     <w:p>

</xml_diff>

<commit_message>
Correct the Fura-2 replicate structure: three independent cultures
The Methods, the Limitations and the Figure 6E caption said the three Ca2+
samples per group came from a single culture plate and were therefore not
independent biological replicates. They come from three independent cultures.
The statement is corrected in the manuscript, in the note sheet of the source
data workbook, and the old wording is now on the forbidden-string list of the
consistency check so it cannot return.

The call for replication with a second silencing reagent and a TDP-43 rescue is
kept: it does not depend on the plate question.
</commit_message>
<xml_diff>
--- a/manuscript/MANUSCRIPT_v4_SUBMISSION.docx
+++ b/manuscript/MANUSCRIPT_v4_SUBMISSION.docx
@@ -1183,7 +1183,7 @@
         <w:pStyle w:val="FirstParagraph"/>
       </w:pPr>
       <w:r>
-        <w:t xml:space="preserve">Measurements were made 72 h after transduction. Cells were seeded in 24-well plates at 40,000 cells per well; the three samples of each group came from a single culture plate and are therefore not independent culture days. Cells were loaded with 5 µM Fura-2/AM and 0.02% Pluronic F-127 in 1% BSA/HBS for 60 min at 25 °C in the dark and washed three times for 15 min in 1% BSA/HBS. HBS contained 135 mM NaCl, 5.9 mM KCl, 1.2 mM MgCl₂, 1.5 mM CaCl₂, 11.6 mM HEPES, 5 mM NaHCO₃ and 11.5 mM D-glucose (pH 7.3). Cytosolic free Ca²⁺ was followed spectrofluorometrically as the F340/F380 ratio (excitation 340 and 380 nm, emission 510 nm; Grynkiewicz et al., 1985) in a cuvette-based system with perfusion, following the protocol of Selli et al. (2009). Loaded cells were transferred to Ca²⁺-free HBS containing EGTA; SERCA was then inhibited with 10 µM cyclopiazonic acid (Sigma-Aldrich, cat. no. C1530) and the transient rise in F340/F380 was recorded as ER Ca²⁺ release. CaCl₂ was then added to a final concentration of 1.5 mM and the subsequent rise was recorded as store-operated Ca²⁺ entry. Both were quantified as Δ(F340/F380) relative to the respective preceding baseline (n = 3 per group).</w:t>
+        <w:t xml:space="preserve">Measurements were made 72 h after transduction. Cells were seeded in 24-well plates at 40,000 cells per well; the three samples of each group came from three independent cultures. Cells were loaded with 5 µM Fura-2/AM and 0.02% Pluronic F-127 in 1% BSA/HBS for 60 min at 25 °C in the dark and washed three times for 15 min in 1% BSA/HBS. HBS contained 135 mM NaCl, 5.9 mM KCl, 1.2 mM MgCl₂, 1.5 mM CaCl₂, 11.6 mM HEPES, 5 mM NaHCO₃ and 11.5 mM D-glucose (pH 7.3). Cytosolic free Ca²⁺ was followed spectrofluorometrically as the F340/F380 ratio (excitation 340 and 380 nm, emission 510 nm; Grynkiewicz et al., 1985) in a cuvette-based system with perfusion, following the protocol of Selli et al. (2009). Loaded cells were transferred to Ca²⁺-free HBS containing EGTA; SERCA was then inhibited with 10 µM cyclopiazonic acid (Sigma-Aldrich, cat. no. C1530) and the transient rise in F340/F380 was recorded as ER Ca²⁺ release. CaCl₂ was then added to a final concentration of 1.5 mM and the subsequent rise was recorded as store-operated Ca²⁺ entry. Both were quantified as Δ(F340/F380) relative to the respective preceding baseline (n = 3 per group).</w:t>
       </w:r>
     </w:p>
     <w:bookmarkEnd w:id="24"/>
@@ -4726,7 +4726,7 @@
         <w:pStyle w:val="FirstParagraph"/>
       </w:pPr>
       <w:r>
-        <w:t xml:space="preserve">SH-SY5Y is a neuroblastoma line and not a motor neuron. The functional measurements rest on three samples per group for Ca²⁺ imaging and four wells for viability, and the three Ca²⁺ samples of each group were prepared from a single culture plate rather than on independent culture days; they are therefore not independent biological replicates and the phenotype requires replication with a second silencing reagent and a TDP-43 rescue. Protein levels, membrane localisation and complex assembly of candidate genes were not measured. The WST-1 assay does not separate proliferation from cell death, and the opposite directions at 24 h and 48 h show that it is not a direct viability measure. Transcript-family summaries are length-corrected short-read estimates, not absolute stoichiometry.</w:t>
+        <w:t xml:space="preserve">SH-SY5Y is a neuroblastoma line and not a motor neuron. The functional measurements rest on three independent cultures per group for Ca²⁺ imaging and four wells for viability; the number of biological replicates is small, and the phenotype requires replication with a second silencing reagent and a TDP-43 rescue. Protein levels, membrane localisation and complex assembly of candidate genes were not measured. The WST-1 assay does not separate proliferation from cell death, and the opposite directions at 24 h and 48 h show that it is not a direct viability measure. Transcript-family summaries are length-corrected short-read estimates, not absolute stoichiometry.</w:t>
       </w:r>
     </w:p>
     <w:p>
@@ -6315,7 +6315,7 @@
         <w:t xml:space="preserve"> </w:t>
       </w:r>
       <w:r>
-        <w:t xml:space="preserve">(A) TARDBP mRNA in non-transduced cells, non-targeting shRNA controls and shTDP-43 cells (2^−ΔΔCt, n = 4; one-way ANOVA on log2 values with Tukey’s test). (B) Relative mRNA of the four SOCE-associated targets (n = 4; two-tailed t-tests). (C) WST-1 viability at 24 h and 48 h (n = 4 wells). (D) Representative Fura-2 traces for a control and a knockdown sample: SERCA inhibition with 10 µM cyclopiazonic acid in Ca²⁺-free medium, then re-addition of 1.5 mM CaCl₂. (E) Group data for the two phases, as Δ(F340/F380) relative to the preceding baseline (n = 3 samples per group, prepared from a single culture plate). Bars are mean ± SEM with individual values; ** p &lt; 0.01, *** p &lt; 0.001, **** p &lt; 0.0001.</w:t>
+        <w:t xml:space="preserve">(A) TARDBP mRNA in non-transduced cells, non-targeting shRNA controls and shTDP-43 cells (2^−ΔΔCt, n = 4; one-way ANOVA on log2 values with Tukey’s test). (B) Relative mRNA of the four SOCE-associated targets (n = 4; two-tailed t-tests). (C) WST-1 viability at 24 h and 48 h (n = 4 wells). (D) Representative Fura-2 traces for a control and a knockdown sample: SERCA inhibition with 10 µM cyclopiazonic acid in Ca²⁺-free medium, then re-addition of 1.5 mM CaCl₂. (E) Group data for the two phases, as Δ(F340/F380) relative to the preceding baseline (n = 3 independent cultures per group). Bars are mean ± SEM with individual values; ** p &lt; 0.01, *** p &lt; 0.001, **** p &lt; 0.0001.</w:t>
       </w:r>
     </w:p>
     <w:p>

</xml_diff>

<commit_message>
Name the laboratory control group, drop the apoptosis markers, remove revision wording
- The target-gene RT-qPCR, Fura-2 and WST-1 experiments compare shTDP-43
  cells with the non-targeting (scrambled) shRNA control; Methods 2.12-2.15,
  Section 3.7, the Figure 6 legend and labels, S1 and the graphical abstract
  now say so. For TARDBP the calibrator is the non-transduced group.
- S1 keeps the four targets reported in the manuscript; the apoptosis
  markers measured on the same RNA are not part of this study.
- Wording that referred to earlier versions ("before the correction",
  "no longer", "our first attempt", "the corrected analysis" and similar)
  is rewritten as method description; the effect of counting reference
  skips (+0.489 instead of +0.145) is kept as a sensitivity note in
  Methods 2.7, and the gene-level STMN2 sentence now reports the current
  eleven regions. The consistency check forbids the old phrases (275 checks).
</commit_message>
<xml_diff>
--- a/manuscript/MANUSCRIPT_v4_SUBMISSION.docx
+++ b/manuscript/MANUSCRIPT_v4_SUBMISSION.docx
@@ -1113,7 +1113,23 @@
         <w:t xml:space="preserve">-j</w:t>
       </w:r>
       <w:r>
-        <w:t xml:space="preserve">. Equivalent windows were built for 687 orthologous mouse genes. The corrected analysis was run in the four knockdown comparisons whose alignments were available — SH-SY5Y, iPSC-derived motor neurons, C2C12 and NSC34 — and results are reported only for units whose input windows passed the depth filter.</w:t>
+        <w:t xml:space="preserve">. Excluding reference skips matters for an intronic index: counted as depth, the skips of spliced reads fill intronic windows, and in SH-SY5Y they would raise the</w:t>
+      </w:r>
+      <w:r>
+        <w:t xml:space="preserve"> </w:t>
+      </w:r>
+      <w:r>
+        <w:rPr>
+          <w:i/>
+          <w:iCs/>
+        </w:rPr>
+        <w:t xml:space="preserve">STMN2</w:t>
+      </w:r>
+      <w:r>
+        <w:t xml:space="preserve"> </w:t>
+      </w:r>
+      <w:r>
+        <w:t xml:space="preserve">intron 2 index difference from +0.145 to +0.489. Equivalent windows were built for 687 orthologous mouse genes. The analysis was run in the four knockdown comparisons whose alignments were available — SH-SY5Y, iPSC-derived motor neurons, C2C12 and NSC34 — and results are reported only for units whose input windows passed the depth filter.</w:t>
       </w:r>
     </w:p>
     <w:p>
@@ -1153,7 +1169,7 @@
         <w:t xml:space="preserve"> </w:t>
       </w:r>
       <w:r>
-        <w:t xml:space="preserve">is the distal half’s share of the terminal exon, following the logic of DaPars (Xia et al., 2014). In the corrected analysis both indices are reported as point estimates with bootstrap intervals obtained by complete enumeration of the replicate combinations rather than by sampling: 3⁶ = 729 combinations for the three-versus-three comparisons and 2⁴ = 16 for the two-versus-two iPSC-derived motor neurons, where the interval is correspondingly coarse. No p or q values are produced. A unit was retained only if the summed depth of its two windows was at least 3 in every sample.</w:t>
+        <w:t xml:space="preserve">is the distal half’s share of the terminal exon, following the logic of DaPars (Xia et al., 2014). Both indices are reported as point estimates with bootstrap intervals obtained by complete enumeration of the replicate combinations rather than by sampling: 3⁶ = 729 combinations for the three-versus-three comparisons and 2⁴ = 16 for the two-versus-two iPSC-derived motor neurons, where the interval is correspondingly coarse. No p or q values are produced. A unit was retained only if the summed depth of its two windows was at least 3 in every sample.</w:t>
       </w:r>
     </w:p>
     <w:bookmarkEnd w:id="17"/>
@@ -1566,7 +1582,7 @@
         <w:pStyle w:val="FirstParagraph"/>
       </w:pPr>
       <w:r>
-        <w:t xml:space="preserve">SH-SY5Y cells were maintained in DMEM/F12 with L-glutamine and 15 mM HEPES, 10% FBS and penicillin–streptomycin, and were mycoplasma-tested. TARDBP was silenced with a pLKO.1-TRC lentiviral shRNA; particles were produced in HEK293T cells and transduced cells selected with puromycin. Three groups were compared: non-transduced cells, a non-targeting shRNA control and shTDP-43. Lentiviral work followed institutional biosafety rules.</w:t>
+        <w:t xml:space="preserve">SH-SY5Y cells were maintained in DMEM/F12 with L-glutamine and 15 mM HEPES, 10% FBS and penicillin–streptomycin, and were mycoplasma-tested. TARDBP was silenced with a pLKO.1-TRC lentiviral shRNA; particles were produced in HEK293T cells and transduced cells selected with puromycin. Three groups were compared: non-transduced cells, a non-targeting (scrambled) shRNA control and shTDP-43. TARDBP knockdown was measured against both control groups; the target-gene RT-qPCR, Fura-2 and WST-1 experiments compared shTDP-43 cells with the non-targeting shRNA control. Lentiviral work followed institutional biosafety rules.</w:t>
       </w:r>
     </w:p>
     <w:bookmarkEnd w:id="22"/>
@@ -1584,7 +1600,7 @@
         <w:pStyle w:val="FirstParagraph"/>
       </w:pPr>
       <w:r>
-        <w:t xml:space="preserve">Total RNA was reverse transcribed and amplified with iTaq Universal SYBR Green Supermix (Bio-Rad, cat. no. 1725121) in 10 µL reactions on a LightCycler 480 II (Roche). Targets and GAPDH were run on the same plate with no-template and no-reverse-transcriptase controls, and specificity was checked from a single melt-curve peak. Relative expression was calculated by the 2^−ΔΔCt method (Livak and Schmittgen, 2001) with the control set to 1.0 (n = 4 biological replicates per group; TARDBP knockdown and the target genes were measured on separate RNA sets, 14 April – 21 May and 3 June – 10 July 2026). Primer sequences, product sizes, annealing temperatures and the thermal cycling profile are given in Supplementary Table S1.</w:t>
+        <w:t xml:space="preserve">Total RNA was reverse transcribed and amplified with iTaq Universal SYBR Green Supermix (Bio-Rad, cat. no. 1725121) in 10 µL reactions on a LightCycler 480 II (Roche). Targets and GAPDH were run on the same plate with no-template and no-reverse-transcriptase controls, and specificity was checked from a single melt-curve peak. Relative expression was calculated by the 2^−ΔΔCt method (Livak and Schmittgen, 2001), with non-transduced cells as the calibrator for TARDBP and the non-targeting shRNA control for the target genes (n = 4 biological replicates per group; TARDBP knockdown and the target genes were measured on separate RNA sets, 14 April – 21 May and 3 June – 10 July 2026). Primer sequences, product sizes, annealing temperatures and the thermal cycling profile are given in Supplementary Table S1.</w:t>
       </w:r>
     </w:p>
     <w:bookmarkEnd w:id="23"/>
@@ -1602,7 +1618,7 @@
         <w:pStyle w:val="FirstParagraph"/>
       </w:pPr>
       <w:r>
-        <w:t xml:space="preserve">Measurements were made 72 h after transduction. Cells were seeded in 24-well plates at 40,000 cells per well; the three samples of each group came from three independent cultures. Cells were loaded with 5 µM Fura-2/AM and 0.02% Pluronic F-127 in 1% BSA/HBS for 60 min at 25 °C in the dark and washed three times for 15 min in 1% BSA/HBS. HBS contained 135 mM NaCl, 5.9 mM KCl, 1.2 mM MgCl₂, 1.5 mM CaCl₂, 11.6 mM HEPES, 5 mM NaHCO₃ and 11.5 mM D-glucose (pH 7.3). Cytosolic free Ca²⁺ was followed spectrofluorometrically as the F340/F380 ratio (excitation 340 and 380 nm, emission 510 nm; Grynkiewicz et al., 1985) in a cuvette-based system with perfusion, following the protocol of Selli et al. (2009). Loaded cells were transferred to Ca²⁺-free HBS containing EGTA; SERCA was then inhibited with 10 µM cyclopiazonic acid (Sigma-Aldrich, cat. no. C1530) and the transient rise in F340/F380 was recorded as ER Ca²⁺ release. CaCl₂ was then added to a final concentration of 1.5 mM and the subsequent rise was recorded as store-operated Ca²⁺ entry. Both were quantified as Δ(F340/F380) relative to the respective preceding baseline (n = 3 per group).</w:t>
+        <w:t xml:space="preserve">Non-targeting shRNA control and shTDP-43 cells were measured 72 h after transduction. Cells were seeded in 24-well plates at 40,000 cells per well; the three samples of each group came from three independent cultures. Cells were loaded with 5 µM Fura-2/AM and 0.02% Pluronic F-127 in 1% BSA/HBS for 60 min at 25 °C in the dark and washed three times for 15 min in 1% BSA/HBS. HBS contained 135 mM NaCl, 5.9 mM KCl, 1.2 mM MgCl₂, 1.5 mM CaCl₂, 11.6 mM HEPES, 5 mM NaHCO₃ and 11.5 mM D-glucose (pH 7.3). Cytosolic free Ca²⁺ was followed spectrofluorometrically as the F340/F380 ratio (excitation 340 and 380 nm, emission 510 nm; Grynkiewicz et al., 1985) in a cuvette-based system with perfusion, following the protocol of Selli et al. (2009). Loaded cells were transferred to Ca²⁺-free HBS containing EGTA; SERCA was then inhibited with 10 µM cyclopiazonic acid (Sigma-Aldrich, cat. no. C1530) and the transient rise in F340/F380 was recorded as ER Ca²⁺ release. CaCl₂ was then added to a final concentration of 1.5 mM and the subsequent rise was recorded as store-operated Ca²⁺ entry. Both were quantified as Δ(F340/F380) relative to the respective preceding baseline (n = 3 per group).</w:t>
       </w:r>
     </w:p>
     <w:bookmarkEnd w:id="24"/>
@@ -1620,7 +1636,7 @@
         <w:pStyle w:val="FirstParagraph"/>
       </w:pPr>
       <w:r>
-        <w:t xml:space="preserve">Viability was measured at 24 h and 48 h with the WST-1 assay, normalised to the mean of the control group at the same time point (n = 4 wells).</w:t>
+        <w:t xml:space="preserve">Viability was measured at 24 h and 48 h with the WST-1 assay, normalised to the mean of the non-targeting shRNA control at the same time point (n = 4 wells).</w:t>
       </w:r>
     </w:p>
     <w:bookmarkEnd w:id="25"/>
@@ -1656,7 +1672,7 @@
         <w:pStyle w:val="FirstParagraph"/>
       </w:pPr>
       <w:r>
-        <w:t xml:space="preserve">All RNA-seq datasets analysed are public and none were generated for this study; accessions are listed in Supplementary Table S17. The analysis package — scripts in execution order, including the corrected coverage, NMD, transcript-family and donor-level scripts used for the results reported here, the four Ca²⁺ gene panels, per-event count tables, junction and LSV tables, and the code that draws every figure — is deposited at</w:t>
+        <w:t xml:space="preserve">All RNA-seq datasets analysed are public and none were generated for this study; accessions are listed in Supplementary Table S17. The analysis package — scripts in execution order, including the coverage, NMD, transcript-family and donor-level scripts used for the results reported here, the four Ca²⁺ gene panels, per-event count tables, junction and LSV tables, and the code that draws every figure — is deposited at</w:t>
       </w:r>
       <w:r>
         <w:t xml:space="preserve"> </w:t>
@@ -1753,7 +1769,7 @@
         <w:pStyle w:val="BodyText"/>
       </w:pPr>
       <w:r>
-        <w:t xml:space="preserve">We applied this reasoning to our own prior candidate. A</w:t>
+        <w:t xml:space="preserve">We applied this reasoning to a</w:t>
       </w:r>
       <w:r>
         <w:t xml:space="preserve"> </w:t>
@@ -1769,7 +1785,7 @@
         <w:t xml:space="preserve"> </w:t>
       </w:r>
       <w:r>
-        <w:t xml:space="preserve">skipped-exon event (chr3:142,792,824–142,792,967; ΔPSI = +0.108, FDR = 0.0459) had been prioritised on threshold criteria. Replicate-level inspection showed that the entire signal derived from seven skipping reads across six libraries, with the skipping form absent in four of six samples; the bootstrap 95% confidence interval spanned zero (−0.093 to +0.522); removing one control replicate reversed the sign of ΔPSI (−0.074); and the event did not survive coverage pre-filtering. LeafCutter did not call</w:t>
+        <w:t xml:space="preserve">skipped-exon event (chr3:142,792,824–142,792,967; ΔPSI = +0.108, FDR = 0.0459) that passes the conventional thresholds and would be prioritised on them alone. Replicate-level inspection showed that the entire signal derived from seven skipping reads across six libraries, with the skipping form absent in four of six samples; the bootstrap 95% confidence interval spanned zero (−0.093 to +0.522); removing one control replicate reversed the sign of ΔPSI (−0.074); and the event did not survive coverage pre-filtering. LeafCutter did not call</w:t>
       </w:r>
       <w:r>
         <w:t xml:space="preserve"> </w:t>
@@ -2647,7 +2663,7 @@
         <w:t xml:space="preserve">STIM2.1</w:t>
       </w:r>
       <w:r>
-        <w:t xml:space="preserve">/STIM2β question to be revisited directly. Inclusion of the 24-nucleotide SOAR exon (chr4:27,007,983–27,008,006) was positive in direction in all five TDP-43 comparisons in which it was measurable, but the effect was small and inconsistent: ΔPSI +0.149 in SH-SY5Y at 75 ng/mL (q = 0.033, 20 versus 3 reads), +0.116 at 25 ng/mL (q = 0.14), and +0.020 in iPSC colonies (q = 0.82), the best-powered comparison with 441 versus 281 reads (Supplementary Table S13). The junction-level estimate is larger than the rMATS estimate for the same exon in the same libraries (+0.149 versus +0.059; Supplementary Table S15) because the two are not the same quantity: rMATS combines both flanking junctions and normalises by effective length, whereas the junction-level PSI is the share of the single downstream junction among all junctions leaving that donor, which is the more sensitive and the noisier of the two for a lowly used exon. On either measure the direction is reproducible and the magnitude is too small to support an isoform switch, and the negative conclusion of the meta-analysis stands.</w:t>
+        <w:t xml:space="preserve">/STIM2β question to be examined directly. Inclusion of the 24-nucleotide SOAR exon (chr4:27,007,983–27,008,006) was positive in direction in all five TDP-43 comparisons in which it was measurable, but the effect was small and inconsistent: ΔPSI +0.149 in SH-SY5Y at 75 ng/mL (q = 0.033, 20 versus 3 reads), +0.116 at 25 ng/mL (q = 0.14), and +0.020 in iPSC colonies (q = 0.82), the best-powered comparison with 441 versus 281 reads (Supplementary Table S13). The junction-level estimate is larger than the rMATS estimate for the same exon in the same libraries (+0.149 versus +0.059; Supplementary Table S15) because the two are not the same quantity: rMATS combines both flanking junctions and normalises by effective length, whereas the junction-level PSI is the share of the single downstream junction among all junctions leaving that donor, which is the more sensitive and the noisier of the two for a lowly used exon. On either measure the direction is reproducible and the magnitude is too small to support an isoform switch, and the negative conclusion of the meta-analysis stands.</w:t>
       </w:r>
     </w:p>
     <w:p>
@@ -2681,7 +2697,7 @@
         <w:pStyle w:val="BodyText"/>
       </w:pPr>
       <w:r>
-        <w:t xml:space="preserve">Because the four interventions reuse the same control and knockdown libraries, the eight difference-of-differences values that the design yields are not eight independent observations. We therefore took the four NMD-inhibition conditions as the unit of inference, averaging the two replicates within each condition and retaining the shared controls only within each contrast. The direction of several positive-control and calcium-gene interactions was retained, but no gene passed genome-wide FDR correction in this conservative analysis (smallest q = 0.053). The result is therefore supportive at the level of a ranked exploratory signal, not a confirmatory NMD test.</w:t>
+        <w:t xml:space="preserve">Because the four interventions reuse the same control and knockdown libraries, the eight difference-of-differences values that the design yields are not eight independent observations. We therefore took the four NMD-inhibition conditions as the unit of inference, averaging the two replicates within each condition and retaining the shared controls only within each contrast. Several positive-control and calcium-gene interactions were positive, but no gene passed genome-wide FDR correction in this conservative analysis (smallest q = 0.053). The result is therefore supportive at the level of a ranked exploratory signal, not a confirmatory NMD test.</w:t>
       </w:r>
     </w:p>
     <w:p>
@@ -2699,7 +2715,7 @@
         <w:t xml:space="preserve"> </w:t>
       </w:r>
       <w:r>
-        <w:t xml:space="preserve">remained the largest SOCE-panel interaction (+1.52 log₂; positive in all four conditions; Supplementary Table S10), but its conservative condition-level q-value was 0.145 (two-sided t-test; exact one-sided sign-test q = 0.310). It is therefore a prioritised candidate rather than an established NMD target.</w:t>
+        <w:t xml:space="preserve">had the largest SOCE-panel interaction (+1.52 log₂; positive in all four conditions; Supplementary Table S10), but its conservative condition-level q-value was 0.145 (two-sided t-test; exact one-sided sign-test q = 0.310). It is therefore a prioritised candidate rather than an established NMD target.</w:t>
       </w:r>
       <w:r>
         <w:t xml:space="preserve"> </w:t>
@@ -2731,7 +2747,7 @@
         <w:t xml:space="preserve"> </w:t>
       </w:r>
       <w:r>
-        <w:t xml:space="preserve">also retained positive interactions, without genome-wide significance after the dependence correction.</w:t>
+        <w:t xml:space="preserve">also had positive interactions, without genome-wide significance.</w:t>
       </w:r>
     </w:p>
     <w:p>
@@ -2768,7 +2784,7 @@
         <w:t xml:space="preserve">not supported</w:t>
       </w:r>
       <w:r>
-        <w:t xml:space="preserve">: in the four-condition analysis the interaction was −0.325 (p = 0.317, q = 0.508), in the opposite direction, and we withdraw that inference. Second, in the same four-condition analysis none of the four Ca²⁺ panels showed collective NMD sensitivity (one-sided Mann–Whitney p = 0.44, 0.91, 0.96 and 0.91 for Tiers 1–4), and the sixteen positive-control genes were not NMD-sensitive as a group either (p = 0.62; Supplementary Table S10b), consistent with the absence of cryptic events in the core machinery.</w:t>
+        <w:t xml:space="preserve">: in the four-condition analysis the interaction was −0.325 (p = 0.317, q = 0.508), in the opposite direction. Second, in the same four-condition analysis none of the four Ca²⁺ panels showed collective NMD sensitivity (one-sided Mann–Whitney p = 0.44, 0.91, 0.96 and 0.91 for Tiers 1–4), and the sixteen positive-control genes were not NMD-sensitive as a group either (p = 0.62; Supplementary Table S10b), consistent with the absence of cryptic events in the SOCE machinery.</w:t>
       </w:r>
     </w:p>
     <w:bookmarkEnd w:id="32"/>
@@ -2810,22 +2826,7 @@
         <w:pStyle w:val="BodyText"/>
       </w:pPr>
       <w:r>
-        <w:t xml:space="preserve">After the</w:t>
-      </w:r>
-      <w:r>
-        <w:t xml:space="preserve"> </w:t>
-      </w:r>
-      <w:r>
-        <w:rPr>
-          <w:rStyle w:val="VerbatimChar"/>
-        </w:rPr>
-        <w:t xml:space="preserve">-j</w:t>
-      </w:r>
-      <w:r>
-        <w:t xml:space="preserve"> </w:t>
-      </w:r>
-      <w:r>
-        <w:t xml:space="preserve">correction, the primary SH-SY5Y positive control no longer showed a near-complete shift: using all six libraries, the corrected</w:t>
+        <w:t xml:space="preserve">In the primary SH-SY5Y model the positive control shifted only moderately: using all six libraries, the</w:t>
       </w:r>
       <w:r>
         <w:t xml:space="preserve"> </w:t>
@@ -2841,7 +2842,7 @@
         <w:t xml:space="preserve"> </w:t>
       </w:r>
       <w:r>
-        <w:t xml:space="preserve">intronic index gave a group difference of +0.145 (bootstrap 95% CI +0.085 to +0.205), against +0.489 before the correction; the earlier estimate included reference-skip coverage and is not retained.</w:t>
+        <w:t xml:space="preserve">intronic index gave a group difference of +0.145 (bootstrap 95% CI +0.085 to +0.205).</w:t>
       </w:r>
       <w:r>
         <w:t xml:space="preserve"> </w:t>
@@ -2865,7 +2866,7 @@
         <w:pStyle w:val="BodyText"/>
       </w:pPr>
       <w:r>
-        <w:t xml:space="preserve">Among the depth-qualified units of the SOCE machinery in the corrected full-panel analysis, two intronic units showed moderate decreases (</w:t>
+        <w:t xml:space="preserve">Among the depth-qualified units of the SOCE machinery in the full-panel analysis, two intronic units showed moderate decreases (</w:t>
       </w:r>
       <w:r>
         <w:rPr>
@@ -2966,7 +2967,7 @@
         <w:pStyle w:val="BodyText"/>
       </w:pPr>
       <w:r>
-        <w:t xml:space="preserve">The corrected analysis therefore identifies at most one moderate candidate gradient in the SOCE machinery, in</w:t>
+        <w:t xml:space="preserve">The analysis therefore identifies at most one moderate candidate gradient in the SOCE machinery, in</w:t>
       </w:r>
       <w:r>
         <w:t xml:space="preserve"> </w:t>
@@ -3140,7 +3141,7 @@
         <w:t xml:space="preserve"> </w:t>
       </w:r>
       <w:r>
-        <w:t xml:space="preserve">rather than being spared. Because the positive control was no longer robust in this model after correction, absence of a signal should not be interpreted as evidence that these genes are definitively spared.</w:t>
+        <w:t xml:space="preserve">rather than being spared. Because the positive control responded only moderately in this model, absence of a signal should not be interpreted as evidence that these genes are definitively spared.</w:t>
       </w:r>
     </w:p>
     <w:p>
@@ -3148,7 +3149,7 @@
         <w:pStyle w:val="BodyText"/>
       </w:pPr>
       <w:r>
-        <w:t xml:space="preserve">We therefore repeated the corrected analysis in the iPSC-derived motor neurons, where 59 units in 29 genes passed the same depth filter. Here the assay’s positive control behaved as intended: the index of</w:t>
+        <w:t xml:space="preserve">We therefore repeated the analysis in the iPSC-derived motor neurons, where 59 units in 29 genes passed the same depth filter. Here the assay’s positive control behaved as intended: the index of</w:t>
       </w:r>
       <w:r>
         <w:t xml:space="preserve"> </w:t>
@@ -3366,7 +3367,7 @@
         <w:pStyle w:val="BodyText"/>
       </w:pPr>
       <w:r>
-        <w:t xml:space="preserve">Taken together, the corrected analyses support altered calcium-related RNA profiles but do not establish whether any SOCE-machinery gene is a direct target of cryptic splicing, APA or NMD-coupled degradation.</w:t>
+        <w:t xml:space="preserve">Taken together, these analyses support altered calcium-related RNA profiles but do not establish whether any SOCE-machinery gene is a direct target of cryptic splicing, APA or NMD-coupled degradation.</w:t>
       </w:r>
     </w:p>
     <w:bookmarkEnd w:id="33"/>
@@ -3434,7 +3435,7 @@
         <w:pStyle w:val="BodyText"/>
       </w:pPr>
       <w:r>
-        <w:t xml:space="preserve">In these cells, mRNA levels of four SOCE-associated targets increased:</w:t>
+        <w:t xml:space="preserve">Relative to the non-targeting shRNA control, mRNA levels of four SOCE-associated targets increased:</w:t>
       </w:r>
       <w:r>
         <w:t xml:space="preserve"> </w:t>
@@ -4936,7 +4937,7 @@
         <w:t xml:space="preserve"> </w:t>
       </w:r>
       <w:r>
-        <w:t xml:space="preserve">Annotation-free junction analysis recovered canonical TDP-43 cryptic targets and none of those controls in FUS or TAF15 knockdown. After correcting the APA coverage calculation for reference skips, the</w:t>
+        <w:t xml:space="preserve">Annotation-free junction analysis recovered canonical TDP-43 cryptic targets and none of those controls in FUS or TAF15 knockdown. In the coverage-based APA analysis the</w:t>
       </w:r>
       <w:r>
         <w:t xml:space="preserve"> </w:t>
@@ -4952,7 +4953,7 @@
         <w:t xml:space="preserve"> </w:t>
       </w:r>
       <w:r>
-        <w:t xml:space="preserve">positive control was no longer a near-complete shift in the primary model, although it remained clear in the iPSC-derived motor neurons (intronic index +0.249), where the SOCE-machinery genes nonetheless moved little; the conservative NMD analysis did not yield a genome-wide significant gene. The corrected data therefore do not establish direct or indirect targeting of the SOCE machinery by any one RNA-processing route.</w:t>
+        <w:t xml:space="preserve">positive control shifted only moderately in the primary model but clearly in the iPSC-derived motor neurons (intronic index +0.249), where the SOCE-machinery genes nonetheless moved little; the conservative NMD analysis did not yield a genome-wide significant gene. These data therefore do not establish direct or indirect targeting of the SOCE machinery by any one RNA-processing route.</w:t>
       </w:r>
       <w:r>
         <w:t xml:space="preserve"> </w:t>
@@ -5073,7 +5074,7 @@
         <w:t xml:space="preserve"> </w:t>
       </w:r>
       <w:r>
-        <w:t xml:space="preserve">Two of our results are cautionary and, we think, generalisable. First, threshold-based splicing calls at the |ΔPSI| ≥ 0.10 level are not interpretable without read-level support: at the coverage typical of these datasets, power at that effect size is below 0.30, so significant calls are enriched for inflated estimates. Our own</w:t>
+        <w:t xml:space="preserve">Two of our results are cautionary and, we think, generalisable. First, threshold-based splicing calls at the |ΔPSI| ≥ 0.10 level are not interpretable without read-level support: at the coverage typical of these datasets, power at that effect size is below 0.30, so significant calls are enriched for inflated estimates. A</w:t>
       </w:r>
       <w:r>
         <w:t xml:space="preserve"> </w:t>
@@ -5089,7 +5090,7 @@
         <w:t xml:space="preserve"> </w:t>
       </w:r>
       <w:r>
-        <w:t xml:space="preserve">candidate failed every robustness check we applied to it, and we report that failure rather than the original call. Second, enrichment tests for splicing changes in curated gene panels require a covariate-matched null. Ca²⁺ channel genes are long, multi-exonic and highly expressed, and against a naive background this alone produces apparent enrichment; matching removed the signal in two of the three human models while leaving it intact in iPSC-derived motor neurons.</w:t>
+        <w:t xml:space="preserve">event that passed the conventional thresholds failed every robustness check we applied to it (Figure 2). Second, enrichment tests for splicing changes in curated gene panels require a covariate-matched null. Ca²⁺ channel genes are long, multi-exonic and highly expressed, and against a naive background this alone produces apparent enrichment; matching removed the signal in two of the three human models while leaving it intact in iPSC-derived motor neurons.</w:t>
       </w:r>
     </w:p>
     <w:p>
@@ -5239,7 +5240,7 @@
         <w:t xml:space="preserve"> </w:t>
       </w:r>
       <w:r>
-        <w:t xml:space="preserve">expression does not scale with the junction-based marker of TDP-43 dysfunction within ALS cases. Our first attempt at this test used gene-level</w:t>
+        <w:t xml:space="preserve">expression does not scale with the junction-based marker of TDP-43 dysfunction within ALS cases. With gene-level</w:t>
       </w:r>
       <w:r>
         <w:t xml:space="preserve"> </w:t>
@@ -5255,7 +5256,23 @@
         <w:t xml:space="preserve"> </w:t>
       </w:r>
       <w:r>
-        <w:t xml:space="preserve">as the proxy and produced positive correlations in all nine regions then examined, the opposite of what the mechanistic model predicts. Gene-level</w:t>
+        <w:t xml:space="preserve">as the proxy,</w:t>
+      </w:r>
+      <w:r>
+        <w:t xml:space="preserve"> </w:t>
+      </w:r>
+      <w:r>
+        <w:rPr>
+          <w:i/>
+          <w:iCs/>
+        </w:rPr>
+        <w:t xml:space="preserve">TRPC1</w:t>
+      </w:r>
+      <w:r>
+        <w:t xml:space="preserve"> </w:t>
+      </w:r>
+      <w:r>
+        <w:t xml:space="preserve">correlates positively in ten of the eleven regions (seven with q &lt; 0.05; Supplementary Table S9), the opposite of what the mechanistic model predicts. Gene-level</w:t>
       </w:r>
       <w:r>
         <w:t xml:space="preserve"> </w:t>
@@ -5420,7 +5437,7 @@
         <w:pStyle w:val="BodyText"/>
       </w:pPr>
       <w:r>
-        <w:t xml:space="preserve">The patient-tissue findings are therefore an association with ALS, and we no longer offer them in support of causation. The regional dissociation is the clearest statement of the problem: cryptic</w:t>
+        <w:t xml:space="preserve">The patient-tissue findings are therefore an association with ALS and are not offered in support of causation. The regional dissociation is the clearest statement of the problem: cryptic</w:t>
       </w:r>
       <w:r>
         <w:t xml:space="preserve"> </w:t>
@@ -5637,7 +5654,7 @@
         <w:pStyle w:val="BodyText"/>
       </w:pPr>
       <w:r>
-        <w:t xml:space="preserve">The corrected alternative-polyadenylation analysis is coverage-based and does not localise poly(A) sites; 3′-end sequencing would be required for that purpose. Excluding reference skips reduced the</w:t>
+        <w:t xml:space="preserve">The alternative-polyadenylation analysis is coverage-based and does not localise poly(A) sites; 3′-end sequencing would be required for that purpose. In SH-SY5Y the</w:t>
       </w:r>
       <w:r>
         <w:t xml:space="preserve"> </w:t>
@@ -5653,7 +5670,7 @@
         <w:t xml:space="preserve"> </w:t>
       </w:r>
       <w:r>
-        <w:t xml:space="preserve">positive control in SH-SY5Y from a near-complete shift to +0.145 (bootstrap 95% CI +0.085 to +0.205), and the control then falls just below the pre-specified depth filter, so the negative result in that model rests on an assay whose sensitivity could not be demonstrated there. Of the four comparisons in which the corrected analysis could be run, the assay’s own positive control is informative only in the iPSC-derived motor neurons, since it is attenuated in SH-SY5Y and the two mouse lines have no conserved control. The iPSC-derived motor neurons have only two replicates per group, so the interval around their working control is coarse. The analysis identified one moderate candidate gradient in SH-SY5Y, in</w:t>
+        <w:t xml:space="preserve">positive control shifted only moderately (+0.145, bootstrap 95% CI +0.085 to +0.205) and falls just below the pre-specified depth filter, so the negative result in that model rests on an assay whose sensitivity could not be demonstrated there. Of the four comparisons in which the analysis could be run, the assay’s own positive control is informative only in the iPSC-derived motor neurons, since it is attenuated in SH-SY5Y and the two mouse lines have no conserved control. The iPSC-derived motor neurons have only two replicates per group, so the interval around their working control is coarse. The analysis identified one moderate candidate gradient in SH-SY5Y, in</w:t>
       </w:r>
       <w:r>
         <w:t xml:space="preserve"> </w:t>
@@ -5735,7 +5752,7 @@
         <w:t xml:space="preserve"> </w:t>
       </w:r>
       <w:r>
-        <w:t xml:space="preserve">splicing identify candidate explanations, but they do not establish protein stoichiometry or a single causal RNA switch. Corrected APA and conservative NMD analyses do not provide confirmatory evidence that SOCE-machinery genes are direct targets of those pathways. In ALS tissue,</w:t>
+        <w:t xml:space="preserve">splicing identify candidate explanations, but they do not establish protein stoichiometry or a single causal RNA switch. Coverage-based APA and conservative NMD analyses do not provide confirmatory evidence that SOCE-machinery genes are direct targets of those pathways. In ALS tissue,</w:t>
       </w:r>
       <w:r>
         <w:t xml:space="preserve"> </w:t>
@@ -7138,13 +7155,13 @@
           <w:b/>
           <w:bCs/>
         </w:rPr>
-        <w:t xml:space="preserve">Figure 5. Specificity of the cryptic calls and the corrected alternative-polyadenylation analysis.</w:t>
-      </w:r>
-      <w:r>
-        <w:t xml:space="preserve"> </w:t>
-      </w:r>
-      <w:r>
-        <w:t xml:space="preserve">(A) Positive-control genes recovered in each human comparison under the permissive definition, with FUS and TAF15 knockdown as controls; the mouse comparisons are omitted because the literature controls are human cryptic events that are not conserved in mouse. (B) Depth-qualified intronic and distal 3′-terminal usage estimates in the corrected SH-SY5Y analysis; the</w:t>
+        <w:t xml:space="preserve">Figure 5. Specificity of the cryptic calls and the coverage-based alternative-polyadenylation analysis.</w:t>
+      </w:r>
+      <w:r>
+        <w:t xml:space="preserve"> </w:t>
+      </w:r>
+      <w:r>
+        <w:t xml:space="preserve">(A) Positive-control genes recovered in each human comparison under the permissive definition, with FUS and TAF15 knockdown as controls; the mouse comparisons are omitted because the literature controls are human cryptic events that are not conserved in mouse. (B) Depth-qualified intronic and distal 3′-terminal usage estimates in SH-SY5Y; the</w:t>
       </w:r>
       <w:r>
         <w:t xml:space="preserve"> </w:t>
@@ -7210,7 +7227,7 @@
         <w:t xml:space="preserve"> </w:t>
       </w:r>
       <w:r>
-        <w:t xml:space="preserve">(A) TARDBP mRNA in non-transduced cells, non-targeting shRNA controls and shTDP-43 cells (2^−ΔΔCt, n = 4; one-way ANOVA on log2 values with Tukey’s test). (B) Relative mRNA of the four SOCE-associated targets (n = 4; two-tailed t-tests). (C) WST-1 viability at 24 h and 48 h (n = 4 wells). (D) Representative Fura-2 traces for a control and a knockdown sample: SERCA inhibition with 10 µM cyclopiazonic acid in Ca²⁺-free medium, then re-addition of 1.5 mM CaCl₂. (E) Group data for the two phases, as Δ(F340/F380) relative to the preceding baseline (n = 3 independent cultures per group). Bars are mean ± SEM with individual values; ** p &lt; 0.01, *** p &lt; 0.001, **** p &lt; 0.0001.</w:t>
+        <w:t xml:space="preserve">(A) TARDBP mRNA in non-transduced cells, non-targeting shRNA controls and shTDP-43 cells (2^−ΔΔCt, n = 4; one-way ANOVA on log2 values with Tukey’s test). (B) Relative mRNA of the four SOCE-associated targets in shTDP-43 cells, relative to the non-targeting shRNA control (n = 4; two-tailed t-tests). (C) WST-1 viability at 24 h and 48 h, as a percentage of the non-targeting shRNA control (n = 4 wells). (D) Representative Fura-2 traces for a non-targeting shRNA control and a shTDP-43 sample: SERCA inhibition with 10 µM cyclopiazonic acid in Ca²⁺-free medium, then re-addition of 1.5 mM CaCl₂. (E) Group data for the two phases, as Δ(F340/F380) relative to the preceding baseline (n = 3 independent cultures per group). Bars are mean ± SEM with individual values; ** p &lt; 0.01, *** p &lt; 0.001, **** p &lt; 0.0001.</w:t>
       </w:r>
     </w:p>
     <w:p>
@@ -7595,7 +7612,7 @@
         <w:t xml:space="preserve"> </w:t>
       </w:r>
       <w:r>
-        <w:t xml:space="preserve">Depth-qualified intronic polyadenylation and 3′UTR usage estimates from the corrected analysis in all four comparisons, with the genomic windows of every unit; these are coverage gradients, not direct poly(A)-site calls.</w:t>
+        <w:t xml:space="preserve">Depth-qualified intronic polyadenylation and 3′UTR usage estimates in all four comparisons, with the genomic windows of every unit; these are coverage gradients, not direct poly(A)-site calls.</w:t>
       </w:r>
     </w:p>
     <w:p>

</xml_diff>

<commit_message>
Remove Y. Kaymaz from the author list; state the three WST-1 experiments
Author decisions of 23 September 2026:
- Y. Kaymaz is not an author: removed from the byline, the affiliation list and the
  author contributions.
- The WST-1 experiment was performed three times; the values and statistics reported
  are the four wells of one experiment. Stated in Methods 2.15, Results 3.7, the Figure 6C
  legend, the Limitations and the S1 README.

QA: 332 checks.
</commit_message>
<xml_diff>
--- a/manuscript/MANUSCRIPT_v4_SUBMISSION.docx
+++ b/manuscript/MANUSCRIPT_v4_SUBMISSION.docx
@@ -20,7 +20,7 @@
           <w:b/>
           <w:bCs/>
         </w:rPr>
-        <w:t xml:space="preserve">Elmasnur Yılmaz¹, Yasin Kaymaz², Yasemin Eraç¹*</w:t>
+        <w:t xml:space="preserve">Elmasnur Yılmaz¹, Yasemin Eraç¹*</w:t>
       </w:r>
     </w:p>
     <w:p>
@@ -29,14 +29,6 @@
       </w:pPr>
       <w:r>
         <w:t xml:space="preserve">¹ Department of Pharmacology, Faculty of Pharmacy, Ege University, İzmir, Türkiye</w:t>
-      </w:r>
-    </w:p>
-    <w:p>
-      <w:pPr>
-        <w:pStyle w:val="BodyText"/>
-      </w:pPr>
-      <w:r>
-        <w:t xml:space="preserve">² Department of Bioengineering / Institute of Natural and Applied Sciences, Ege University, İzmir, Türkiye</w:t>
       </w:r>
     </w:p>
     <w:p>
@@ -1658,7 +1650,7 @@
         <w:pStyle w:val="FirstParagraph"/>
       </w:pPr>
       <w:r>
-        <w:t xml:space="preserve">Viability was measured at 24 h and 48 h after seeding with the WST-1 assay (Premix WST-1, Takara Bio, cat. no. MK400). Cells were seeded at 10,000 per well in 100 µL in 96-well plates; at each time point 10 µL reagent was added for 3 h at 37 °C, and absorbance was read at 450 nm against a 620 nm reference on a Varioskan Flash reader (Thermo Scientific). The absorbance of cell-free wells containing medium and reagent was subtracted, and values were normalised to the mean of the non-targeting shRNA control at the same time point (n = 4 wells).</w:t>
+        <w:t xml:space="preserve">Viability was measured at 24 h and 48 h after seeding with the WST-1 assay (Premix WST-1, Takara Bio, cat. no. MK400). Cells were seeded at 10,000 per well in 100 µL in 96-well plates; at each time point 10 µL reagent was added for 3 h at 37 °C, and absorbance was read at 450 nm against a 620 nm reference on a Varioskan Flash reader (Thermo Scientific). The absorbance of cell-free wells containing medium and reagent was subtracted, and values were normalised to the mean of the non-targeting shRNA control at the same time point. The experiment was performed three times; the values and statistics reported are those of one experiment (n = 4 wells per group).</w:t>
       </w:r>
     </w:p>
     <w:bookmarkEnd w:id="25"/>
@@ -3574,7 +3566,7 @@
         <w:pStyle w:val="BodyText"/>
       </w:pPr>
       <w:r>
-        <w:t xml:space="preserve">Functionally, however, the SOCE response fell markedly (Figure 6). ER Ca²⁺ release did not differ significantly between groups (control 0.268 ± 0.042 versus shTDP-43 0.180 ± 0.061 Δ(F340/F380); p = 0.299), whereas store-operated Ca²⁺ entry decreased from 1.542 ± 0.282 to 0.245 ± 0.083 (p = 0.0115; n = 3 per group). Viability moved in opposite directions at the two time points measured: 116.8 ± 1.6% of control at 24 h (p = 2.4 × 10⁻⁴) and 61.5 ± 0.8% at 48 h (p = 2.1 × 10⁻⁷; n = 4 wells).</w:t>
+        <w:t xml:space="preserve">Functionally, however, the SOCE response fell markedly (Figure 6). ER Ca²⁺ release did not differ significantly between groups (control 0.268 ± 0.042 versus shTDP-43 0.180 ± 0.061 Δ(F340/F380); p = 0.299), whereas store-operated Ca²⁺ entry decreased from 1.542 ± 0.282 to 0.245 ± 0.083 (p = 0.0115; n = 3 per group). Viability moved in opposite directions at the two time points measured: 116.8 ± 1.6% of control at 24 h (p = 2.4 × 10⁻⁴) and 61.5 ± 0.8% at 48 h (p = 2.1 × 10⁻⁷; n = 4 wells from one of three independent experiments).</w:t>
       </w:r>
     </w:p>
     <w:p>
@@ -5558,7 +5550,7 @@
         <w:t xml:space="preserve"> </w:t>
       </w:r>
       <w:r>
-        <w:t xml:space="preserve">method that target and reference genes amplify with equal efficiency. The WST-1 assay does not separate proliferation from cell death, and the opposite directions at 24 h and 48 h show that it is not a direct viability measure. Its comparison rests on four wells per group from a single experiment, so the very small p values reflect well-to-well rather than biological variation, and the reduced signal at 48 h leaves open whether impaired cell health contributes to the lower SOCE response. Transcript-family summaries are length- and composition-adjusted short-read estimates, not absolute stoichiometry.</w:t>
+        <w:t xml:space="preserve">method that target and reference genes amplify with equal efficiency. The WST-1 assay does not separate proliferation from cell death, and the opposite directions at 24 h and 48 h show that it is not a direct viability measure. The experiment was performed three times, but the statistics reported compare the four wells of one experiment, so the very small p values reflect well-to-well rather than between-experiment variation; the reduced signal at 48 h also leaves open whether impaired cell health contributes to the lower SOCE response. Transcript-family summaries are length- and composition-adjusted short-read estimates, not absolute stoichiometry.</w:t>
       </w:r>
     </w:p>
     <w:p>
@@ -7373,7 +7365,7 @@
         <w:t xml:space="preserve"> </w:t>
       </w:r>
       <w:r>
-        <w:t xml:space="preserve">E.Y. performed the laboratory experiments, carried out the computational analyses, prepared the figures and wrote the first draft. Y.K. supervised the computational analyses. Y.E. conceived and supervised the study. All authors read and approved the final manuscript.</w:t>
+        <w:t xml:space="preserve">E.Y. performed the laboratory experiments, carried out the computational analyses, prepared the figures and wrote the first draft. Y.E. conceived and supervised the study. All authors read and approved the final manuscript.</w:t>
       </w:r>
       <w:r>
         <w:t xml:space="preserve"> </w:t>
@@ -7658,7 +7650,7 @@
         <w:t xml:space="preserve">−ΔΔCt</w:t>
       </w:r>
       <w:r>
-        <w:t xml:space="preserve">, n = 4; one-way ANOVA on log2 values with Tukey’s test). (B) Relative mRNA of the four SOCE-associated targets in shTDP-43 cells, relative to the non-targeting shRNA control (n = 4; two-tailed t-tests). (C) WST-1 viability at 24 h and 48 h, as a percentage of the non-targeting shRNA control (n = 4 wells). (D) Representative Fura-2 traces for a non-targeting shRNA control and a shTDP-43 sample: SERCA inhibition with 10 µM cyclopiazonic acid in Ca²⁺-free medium, then re-addition of 1.5 mM CaCl₂; the two traces are shown on different vertical scales and time windows, and the group comparison is in (E). (E) Group data for the two phases, as Δ(F340/F380) relative to the preceding baseline (n = 3 independent cultures per group). Bars are mean ± SEM with individual values; ** p &lt; 0.01, *** p &lt; 0.001, **** p &lt; 0.0001.</w:t>
+        <w:t xml:space="preserve">, n = 4; one-way ANOVA on log2 values with Tukey’s test). (B) Relative mRNA of the four SOCE-associated targets in shTDP-43 cells, relative to the non-targeting shRNA control (n = 4; two-tailed t-tests). (C) WST-1 viability at 24 h and 48 h, as a percentage of the non-targeting shRNA control (n = 4 wells from one of three independent experiments). (D) Representative Fura-2 traces for a non-targeting shRNA control and a shTDP-43 sample: SERCA inhibition with 10 µM cyclopiazonic acid in Ca²⁺-free medium, then re-addition of 1.5 mM CaCl₂; the two traces are shown on different vertical scales and time windows, and the group comparison is in (E). (E) Group data for the two phases, as Δ(F340/F380) relative to the preceding baseline (n = 3 independent cultures per group). Bars are mean ± SEM with individual values; ** p &lt; 0.01, *** p &lt; 0.001, **** p &lt; 0.0001.</w:t>
       </w:r>
     </w:p>
     <w:p>

</xml_diff>

<commit_message>
Expand the author contributions of Y.E.
Y.E. conceived and designed the study, provided the Fura-2 methodology and laboratory resources, secured the BAP 31901 funding, supervised the work, contributed to interpretation and revised the manuscript. The confirmation placeholder is removed.
</commit_message>
<xml_diff>
--- a/manuscript/MANUSCRIPT_v4_SUBMISSION.docx
+++ b/manuscript/MANUSCRIPT_v4_SUBMISSION.docx
@@ -7365,17 +7365,7 @@
         <w:t xml:space="preserve"> </w:t>
       </w:r>
       <w:r>
-        <w:t xml:space="preserve">E.Y. performed the laboratory experiments, carried out the computational analyses, prepared the figures and wrote the first draft. Y.E. conceived and supervised the study. All authors read and approved the final manuscript.</w:t>
-      </w:r>
-      <w:r>
-        <w:t xml:space="preserve"> </w:t>
-      </w:r>
-      <w:r>
-        <w:rPr>
-          <w:i/>
-          <w:iCs/>
-        </w:rPr>
-        <w:t xml:space="preserve">[To be confirmed by all authors before submission.]</w:t>
+        <w:t xml:space="preserve">E.Y. performed the laboratory experiments, carried out the computational analyses, prepared the figures and wrote the first draft. Y.E. conceived and designed the study, provided the Fura-2 Ca²⁺ measurement methodology and the laboratory resources, secured the funding (Ege University BAP project 31901), supervised the experimental and computational work, contributed to the interpretation of the results and critically revised the manuscript. Both authors read and approved the final manuscript.</w:t>
       </w:r>
     </w:p>
     <w:p>

</xml_diff>

<commit_message>
State the author contributions as CRediT roles
</commit_message>
<xml_diff>
--- a/manuscript/MANUSCRIPT_v4_SUBMISSION.docx
+++ b/manuscript/MANUSCRIPT_v4_SUBMISSION.docx
@@ -7359,13 +7359,13 @@
           <w:b/>
           <w:bCs/>
         </w:rPr>
-        <w:t xml:space="preserve">Author contributions.</w:t>
-      </w:r>
-      <w:r>
-        <w:t xml:space="preserve"> </w:t>
-      </w:r>
-      <w:r>
-        <w:t xml:space="preserve">E.Y. performed the laboratory experiments, carried out the computational analyses, prepared the figures and wrote the first draft. Y.E. conceived and designed the study, provided the Fura-2 Ca²⁺ measurement methodology and the laboratory resources, secured the funding (Ege University BAP project 31901), supervised the experimental and computational work, contributed to the interpretation of the results and critically revised the manuscript. Both authors read and approved the final manuscript.</w:t>
+        <w:t xml:space="preserve">Author contributions (CRediT).</w:t>
+      </w:r>
+      <w:r>
+        <w:t xml:space="preserve"> </w:t>
+      </w:r>
+      <w:r>
+        <w:t xml:space="preserve">Elmasnur Yılmaz: Investigation, Formal analysis, Software, Visualization, Writing – original draft. Yasemin Eraç: Conceptualization, Methodology, Resources, Funding acquisition, Supervision, Writing – review &amp; editing. Both authors read and approved the final manuscript.</w:t>
       </w:r>
     </w:p>
     <w:p>

</xml_diff>

<commit_message>
Report WST-1 at 48 h only, the time point the thesis reports
Figure 6C, S1, Methods 2.15, Results 3.7, the Figure 6 legend and the Limitations now give the 48 h measurement only. QA: 336 checks.
</commit_message>
<xml_diff>
--- a/manuscript/MANUSCRIPT_v4_SUBMISSION.docx
+++ b/manuscript/MANUSCRIPT_v4_SUBMISSION.docx
@@ -1650,7 +1650,7 @@
         <w:pStyle w:val="FirstParagraph"/>
       </w:pPr>
       <w:r>
-        <w:t xml:space="preserve">Viability was measured at 24 h and 48 h after seeding with the WST-1 assay (Premix WST-1, Takara Bio, cat. no. MK400). Cells were seeded at 10,000 per well in 100 µL in 96-well plates; at each time point 10 µL reagent was added for 3 h at 37 °C, and absorbance was read at 450 nm against a 620 nm reference on a Varioskan Flash reader (Thermo Scientific). The absorbance of cell-free wells containing medium and reagent was subtracted, and values were normalised to the mean of the non-targeting shRNA control at the same time point. The experiment was performed three times; the values and statistics reported are those of one experiment (n = 4 wells per group).</w:t>
+        <w:t xml:space="preserve">Viability was measured 48 h after seeding with the WST-1 assay (Premix WST-1, Takara Bio, cat. no. MK400). Cells were seeded at 10,000 per well in 100 µL in 96-well plates; after 48 h, 10 µL reagent was added for 3 h at 37 °C, and absorbance was read at 450 nm against a 620 nm reference on a Varioskan Flash reader (Thermo Scientific). The absorbance of cell-free wells containing medium and reagent was subtracted, and values were normalised to the mean of the non-targeting shRNA control. The experiment was performed three times; the values and statistics reported are those of one experiment (n = 4 wells per group).</w:t>
       </w:r>
     </w:p>
     <w:bookmarkEnd w:id="25"/>
@@ -3566,7 +3566,7 @@
         <w:pStyle w:val="BodyText"/>
       </w:pPr>
       <w:r>
-        <w:t xml:space="preserve">Functionally, however, the SOCE response fell markedly (Figure 6). ER Ca²⁺ release did not differ significantly between groups (control 0.268 ± 0.042 versus shTDP-43 0.180 ± 0.061 Δ(F340/F380); p = 0.299), whereas store-operated Ca²⁺ entry decreased from 1.542 ± 0.282 to 0.245 ± 0.083 (p = 0.0115; n = 3 per group). Viability moved in opposite directions at the two time points measured: 116.8 ± 1.6% of control at 24 h (p = 2.4 × 10⁻⁴) and 61.5 ± 0.8% at 48 h (p = 2.1 × 10⁻⁷; n = 4 wells from one of three independent experiments).</w:t>
+        <w:t xml:space="preserve">Functionally, however, the SOCE response fell markedly (Figure 6). ER Ca²⁺ release did not differ significantly between groups (control 0.268 ± 0.042 versus shTDP-43 0.180 ± 0.061 Δ(F340/F380); p = 0.299), whereas store-operated Ca²⁺ entry decreased from 1.542 ± 0.282 to 0.245 ± 0.083 (p = 0.0115; n = 3 per group). Viability at 48 h was 61.5 ± 0.8% of control (p = 2.1 × 10⁻⁷; n = 4 wells from one of three independent experiments).</w:t>
       </w:r>
     </w:p>
     <w:p>
@@ -5550,7 +5550,7 @@
         <w:t xml:space="preserve"> </w:t>
       </w:r>
       <w:r>
-        <w:t xml:space="preserve">method that target and reference genes amplify with equal efficiency. The WST-1 assay does not separate proliferation from cell death, and the opposite directions at 24 h and 48 h show that it is not a direct viability measure. The experiment was performed three times, but the statistics reported compare the four wells of one experiment, so the very small p values reflect well-to-well rather than between-experiment variation; the reduced signal at 48 h also leaves open whether impaired cell health contributes to the lower SOCE response. Transcript-family summaries are length- and composition-adjusted short-read estimates, not absolute stoichiometry.</w:t>
+        <w:t xml:space="preserve">method that target and reference genes amplify with equal efficiency. The WST-1 assay measures metabolic activity and does not separate proliferation from cell death. The experiment was performed three times, but the statistics reported compare the four wells of one experiment, so the very small p values reflect well-to-well rather than between-experiment variation; the reduced signal at 48 h also leaves open whether impaired cell health contributes to the lower SOCE response. Transcript-family summaries are length- and composition-adjusted short-read estimates, not absolute stoichiometry.</w:t>
       </w:r>
     </w:p>
     <w:p>
@@ -7640,7 +7640,7 @@
         <w:t xml:space="preserve">−ΔΔCt</w:t>
       </w:r>
       <w:r>
-        <w:t xml:space="preserve">, n = 4; one-way ANOVA on log2 values with Tukey’s test). (B) Relative mRNA of the four SOCE-associated targets in shTDP-43 cells, relative to the non-targeting shRNA control (n = 4; two-tailed t-tests). (C) WST-1 viability at 24 h and 48 h, as a percentage of the non-targeting shRNA control (n = 4 wells from one of three independent experiments). (D) Representative Fura-2 traces for a non-targeting shRNA control and a shTDP-43 sample: SERCA inhibition with 10 µM cyclopiazonic acid in Ca²⁺-free medium, then re-addition of 1.5 mM CaCl₂; the two traces are shown on different vertical scales and time windows, and the group comparison is in (E). (E) Group data for the two phases, as Δ(F340/F380) relative to the preceding baseline (n = 3 independent cultures per group). Bars are mean ± SEM with individual values; ** p &lt; 0.01, *** p &lt; 0.001, **** p &lt; 0.0001.</w:t>
+        <w:t xml:space="preserve">, n = 4; one-way ANOVA on log2 values with Tukey’s test). (B) Relative mRNA of the four SOCE-associated targets in shTDP-43 cells, relative to the non-targeting shRNA control (n = 4; two-tailed t-tests). (C) WST-1 viability at 48 h, as a percentage of the non-targeting shRNA control (n = 4 wells from one of three independent experiments). (D) Representative Fura-2 traces for a non-targeting shRNA control and a shTDP-43 sample: SERCA inhibition with 10 µM cyclopiazonic acid in Ca²⁺-free medium, then re-addition of 1.5 mM CaCl₂; the two traces are shown on different vertical scales and time windows, and the group comparison is in (E). (E) Group data for the two phases, as Δ(F340/F380) relative to the preceding baseline (n = 3 independent cultures per group). Bars are mean ± SEM with individual values; ** p &lt; 0.01, *** p &lt; 0.001, **** p &lt; 0.0001.</w:t>
       </w:r>
     </w:p>
     <w:p>

</xml_diff>

<commit_message>
Revert "Report WST-1 at 48 h only, the time point the thesis reports"
This reverts commit b60325d21b4015eb3a92357a296436e859b74180.
</commit_message>
<xml_diff>
--- a/manuscript/MANUSCRIPT_v4_SUBMISSION.docx
+++ b/manuscript/MANUSCRIPT_v4_SUBMISSION.docx
@@ -1650,7 +1650,7 @@
         <w:pStyle w:val="FirstParagraph"/>
       </w:pPr>
       <w:r>
-        <w:t xml:space="preserve">Viability was measured 48 h after seeding with the WST-1 assay (Premix WST-1, Takara Bio, cat. no. MK400). Cells were seeded at 10,000 per well in 100 µL in 96-well plates; after 48 h, 10 µL reagent was added for 3 h at 37 °C, and absorbance was read at 450 nm against a 620 nm reference on a Varioskan Flash reader (Thermo Scientific). The absorbance of cell-free wells containing medium and reagent was subtracted, and values were normalised to the mean of the non-targeting shRNA control. The experiment was performed three times; the values and statistics reported are those of one experiment (n = 4 wells per group).</w:t>
+        <w:t xml:space="preserve">Viability was measured at 24 h and 48 h after seeding with the WST-1 assay (Premix WST-1, Takara Bio, cat. no. MK400). Cells were seeded at 10,000 per well in 100 µL in 96-well plates; at each time point 10 µL reagent was added for 3 h at 37 °C, and absorbance was read at 450 nm against a 620 nm reference on a Varioskan Flash reader (Thermo Scientific). The absorbance of cell-free wells containing medium and reagent was subtracted, and values were normalised to the mean of the non-targeting shRNA control at the same time point. The experiment was performed three times; the values and statistics reported are those of one experiment (n = 4 wells per group).</w:t>
       </w:r>
     </w:p>
     <w:bookmarkEnd w:id="25"/>
@@ -3566,7 +3566,7 @@
         <w:pStyle w:val="BodyText"/>
       </w:pPr>
       <w:r>
-        <w:t xml:space="preserve">Functionally, however, the SOCE response fell markedly (Figure 6). ER Ca²⁺ release did not differ significantly between groups (control 0.268 ± 0.042 versus shTDP-43 0.180 ± 0.061 Δ(F340/F380); p = 0.299), whereas store-operated Ca²⁺ entry decreased from 1.542 ± 0.282 to 0.245 ± 0.083 (p = 0.0115; n = 3 per group). Viability at 48 h was 61.5 ± 0.8% of control (p = 2.1 × 10⁻⁷; n = 4 wells from one of three independent experiments).</w:t>
+        <w:t xml:space="preserve">Functionally, however, the SOCE response fell markedly (Figure 6). ER Ca²⁺ release did not differ significantly between groups (control 0.268 ± 0.042 versus shTDP-43 0.180 ± 0.061 Δ(F340/F380); p = 0.299), whereas store-operated Ca²⁺ entry decreased from 1.542 ± 0.282 to 0.245 ± 0.083 (p = 0.0115; n = 3 per group). Viability moved in opposite directions at the two time points measured: 116.8 ± 1.6% of control at 24 h (p = 2.4 × 10⁻⁴) and 61.5 ± 0.8% at 48 h (p = 2.1 × 10⁻⁷; n = 4 wells from one of three independent experiments).</w:t>
       </w:r>
     </w:p>
     <w:p>
@@ -5550,7 +5550,7 @@
         <w:t xml:space="preserve"> </w:t>
       </w:r>
       <w:r>
-        <w:t xml:space="preserve">method that target and reference genes amplify with equal efficiency. The WST-1 assay measures metabolic activity and does not separate proliferation from cell death. The experiment was performed three times, but the statistics reported compare the four wells of one experiment, so the very small p values reflect well-to-well rather than between-experiment variation; the reduced signal at 48 h also leaves open whether impaired cell health contributes to the lower SOCE response. Transcript-family summaries are length- and composition-adjusted short-read estimates, not absolute stoichiometry.</w:t>
+        <w:t xml:space="preserve">method that target and reference genes amplify with equal efficiency. The WST-1 assay does not separate proliferation from cell death, and the opposite directions at 24 h and 48 h show that it is not a direct viability measure. The experiment was performed three times, but the statistics reported compare the four wells of one experiment, so the very small p values reflect well-to-well rather than between-experiment variation; the reduced signal at 48 h also leaves open whether impaired cell health contributes to the lower SOCE response. Transcript-family summaries are length- and composition-adjusted short-read estimates, not absolute stoichiometry.</w:t>
       </w:r>
     </w:p>
     <w:p>
@@ -7640,7 +7640,7 @@
         <w:t xml:space="preserve">−ΔΔCt</w:t>
       </w:r>
       <w:r>
-        <w:t xml:space="preserve">, n = 4; one-way ANOVA on log2 values with Tukey’s test). (B) Relative mRNA of the four SOCE-associated targets in shTDP-43 cells, relative to the non-targeting shRNA control (n = 4; two-tailed t-tests). (C) WST-1 viability at 48 h, as a percentage of the non-targeting shRNA control (n = 4 wells from one of three independent experiments). (D) Representative Fura-2 traces for a non-targeting shRNA control and a shTDP-43 sample: SERCA inhibition with 10 µM cyclopiazonic acid in Ca²⁺-free medium, then re-addition of 1.5 mM CaCl₂; the two traces are shown on different vertical scales and time windows, and the group comparison is in (E). (E) Group data for the two phases, as Δ(F340/F380) relative to the preceding baseline (n = 3 independent cultures per group). Bars are mean ± SEM with individual values; ** p &lt; 0.01, *** p &lt; 0.001, **** p &lt; 0.0001.</w:t>
+        <w:t xml:space="preserve">, n = 4; one-way ANOVA on log2 values with Tukey’s test). (B) Relative mRNA of the four SOCE-associated targets in shTDP-43 cells, relative to the non-targeting shRNA control (n = 4; two-tailed t-tests). (C) WST-1 viability at 24 h and 48 h, as a percentage of the non-targeting shRNA control (n = 4 wells from one of three independent experiments). (D) Representative Fura-2 traces for a non-targeting shRNA control and a shTDP-43 sample: SERCA inhibition with 10 µM cyclopiazonic acid in Ca²⁺-free medium, then re-addition of 1.5 mM CaCl₂; the two traces are shown on different vertical scales and time windows, and the group comparison is in (E). (E) Group data for the two phases, as Δ(F340/F380) relative to the preceding baseline (n = 3 independent cultures per group). Bars are mean ± SEM with individual values; ** p &lt; 0.01, *** p &lt; 0.001, **** p &lt; 0.0001.</w:t>
       </w:r>
     </w:p>
     <w:p>

</xml_diff>